<commit_message>
Rapport s3 16 au 20 Mars
</commit_message>
<xml_diff>
--- a/RAPPORT semaine/s3 19-20 mars/RAPPORT s3 16-20 Mars.docx
+++ b/RAPPORT semaine/s3 19-20 mars/RAPPORT s3 16-20 Mars.docx
@@ -150,6 +150,940 @@
         </w:rPr>
       </w:pPr>
     </w:p>
+    <w:sdt>
+      <w:sdtPr>
+        <w:id w:val="1228649451"/>
+        <w:docPartObj>
+          <w:docPartGallery w:val="Table of Contents"/>
+          <w:docPartUnique/>
+        </w:docPartObj>
+      </w:sdtPr>
+      <w:sdtEndPr>
+        <w:rPr>
+          <w:rFonts w:asciiTheme="minorHAnsi" w:eastAsiaTheme="minorHAnsi" w:hAnsiTheme="minorHAnsi" w:cstheme="minorBidi"/>
+          <w:b/>
+          <w:bCs/>
+          <w:color w:val="auto"/>
+          <w:kern w:val="2"/>
+          <w:sz w:val="24"/>
+          <w:szCs w:val="24"/>
+          <w:lang w:eastAsia="en-US"/>
+          <w14:ligatures w14:val="standardContextual"/>
+        </w:rPr>
+      </w:sdtEndPr>
+      <w:sdtContent>
+        <w:p>
+          <w:pPr>
+            <w:pStyle w:val="En-ttedetabledesmatires"/>
+          </w:pPr>
+          <w:r>
+            <w:t>Table des matières</w:t>
+          </w:r>
+        </w:p>
+        <w:p>
+          <w:pPr>
+            <w:pStyle w:val="TM1"/>
+            <w:tabs>
+              <w:tab w:val="right" w:leader="dot" w:pos="9062"/>
+            </w:tabs>
+            <w:rPr>
+              <w:noProof/>
+            </w:rPr>
+          </w:pPr>
+          <w:r>
+            <w:fldChar w:fldCharType="begin"/>
+          </w:r>
+          <w:r>
+            <w:instrText xml:space="preserve"> TOC \o "1-3" \h \z \u </w:instrText>
+          </w:r>
+          <w:r>
+            <w:fldChar w:fldCharType="separate"/>
+          </w:r>
+          <w:hyperlink w:anchor="_Toc225429868" w:history="1">
+            <w:r>
+              <w:rPr>
+                <w:rStyle w:val="Lienhypertexte"/>
+                <w:noProof/>
+              </w:rPr>
+              <w:t>1. Bilan du travail de la semaine (16 au 20 Mars)</w:t>
+            </w:r>
+            <w:r>
+              <w:rPr>
+                <w:noProof/>
+                <w:webHidden/>
+              </w:rPr>
+              <w:tab/>
+            </w:r>
+            <w:r>
+              <w:rPr>
+                <w:noProof/>
+                <w:webHidden/>
+              </w:rPr>
+              <w:fldChar w:fldCharType="begin"/>
+            </w:r>
+            <w:r>
+              <w:rPr>
+                <w:noProof/>
+                <w:webHidden/>
+              </w:rPr>
+              <w:instrText xml:space="preserve"> PAGEREF _Toc225429868 \h </w:instrText>
+            </w:r>
+            <w:r>
+              <w:rPr>
+                <w:noProof/>
+                <w:webHidden/>
+              </w:rPr>
+            </w:r>
+            <w:r>
+              <w:rPr>
+                <w:noProof/>
+                <w:webHidden/>
+              </w:rPr>
+              <w:fldChar w:fldCharType="separate"/>
+            </w:r>
+            <w:r>
+              <w:rPr>
+                <w:noProof/>
+                <w:webHidden/>
+              </w:rPr>
+              <w:t>2</w:t>
+            </w:r>
+            <w:r>
+              <w:rPr>
+                <w:noProof/>
+                <w:webHidden/>
+              </w:rPr>
+              <w:fldChar w:fldCharType="end"/>
+            </w:r>
+          </w:hyperlink>
+        </w:p>
+        <w:p>
+          <w:pPr>
+            <w:pStyle w:val="TM2"/>
+            <w:tabs>
+              <w:tab w:val="right" w:leader="dot" w:pos="9062"/>
+            </w:tabs>
+            <w:rPr>
+              <w:noProof/>
+            </w:rPr>
+          </w:pPr>
+          <w:hyperlink w:anchor="_Toc225429869" w:history="1">
+            <w:r>
+              <w:rPr>
+                <w:rStyle w:val="Lienhypertexte"/>
+                <w:noProof/>
+              </w:rPr>
+              <w:t>1.1 Finalisation de la BDD</w:t>
+            </w:r>
+            <w:r>
+              <w:rPr>
+                <w:noProof/>
+                <w:webHidden/>
+              </w:rPr>
+              <w:tab/>
+            </w:r>
+            <w:r>
+              <w:rPr>
+                <w:noProof/>
+                <w:webHidden/>
+              </w:rPr>
+              <w:fldChar w:fldCharType="begin"/>
+            </w:r>
+            <w:r>
+              <w:rPr>
+                <w:noProof/>
+                <w:webHidden/>
+              </w:rPr>
+              <w:instrText xml:space="preserve"> PAGEREF _Toc225429869 \h </w:instrText>
+            </w:r>
+            <w:r>
+              <w:rPr>
+                <w:noProof/>
+                <w:webHidden/>
+              </w:rPr>
+            </w:r>
+            <w:r>
+              <w:rPr>
+                <w:noProof/>
+                <w:webHidden/>
+              </w:rPr>
+              <w:fldChar w:fldCharType="separate"/>
+            </w:r>
+            <w:r>
+              <w:rPr>
+                <w:noProof/>
+                <w:webHidden/>
+              </w:rPr>
+              <w:t>2</w:t>
+            </w:r>
+            <w:r>
+              <w:rPr>
+                <w:noProof/>
+                <w:webHidden/>
+              </w:rPr>
+              <w:fldChar w:fldCharType="end"/>
+            </w:r>
+          </w:hyperlink>
+        </w:p>
+        <w:p>
+          <w:pPr>
+            <w:pStyle w:val="TM3"/>
+            <w:tabs>
+              <w:tab w:val="right" w:leader="dot" w:pos="9062"/>
+            </w:tabs>
+            <w:rPr>
+              <w:noProof/>
+            </w:rPr>
+          </w:pPr>
+          <w:hyperlink w:anchor="_Toc225429870" w:history="1">
+            <w:r>
+              <w:rPr>
+                <w:rStyle w:val="Lienhypertexte"/>
+                <w:noProof/>
+              </w:rPr>
+              <w:t>A) Table Examen</w:t>
+            </w:r>
+            <w:r>
+              <w:rPr>
+                <w:noProof/>
+                <w:webHidden/>
+              </w:rPr>
+              <w:tab/>
+            </w:r>
+            <w:r>
+              <w:rPr>
+                <w:noProof/>
+                <w:webHidden/>
+              </w:rPr>
+              <w:fldChar w:fldCharType="begin"/>
+            </w:r>
+            <w:r>
+              <w:rPr>
+                <w:noProof/>
+                <w:webHidden/>
+              </w:rPr>
+              <w:instrText xml:space="preserve"> PAGEREF _Toc225429870 \h </w:instrText>
+            </w:r>
+            <w:r>
+              <w:rPr>
+                <w:noProof/>
+                <w:webHidden/>
+              </w:rPr>
+            </w:r>
+            <w:r>
+              <w:rPr>
+                <w:noProof/>
+                <w:webHidden/>
+              </w:rPr>
+              <w:fldChar w:fldCharType="separate"/>
+            </w:r>
+            <w:r>
+              <w:rPr>
+                <w:noProof/>
+                <w:webHidden/>
+              </w:rPr>
+              <w:t>2</w:t>
+            </w:r>
+            <w:r>
+              <w:rPr>
+                <w:noProof/>
+                <w:webHidden/>
+              </w:rPr>
+              <w:fldChar w:fldCharType="end"/>
+            </w:r>
+          </w:hyperlink>
+        </w:p>
+        <w:p>
+          <w:pPr>
+            <w:pStyle w:val="TM3"/>
+            <w:tabs>
+              <w:tab w:val="right" w:leader="dot" w:pos="9062"/>
+            </w:tabs>
+            <w:rPr>
+              <w:noProof/>
+            </w:rPr>
+          </w:pPr>
+          <w:hyperlink w:anchor="_Toc225429871" w:history="1">
+            <w:r>
+              <w:rPr>
+                <w:rStyle w:val="Lienhypertexte"/>
+                <w:noProof/>
+              </w:rPr>
+              <w:t>B) Point de vigilance</w:t>
+            </w:r>
+            <w:r>
+              <w:rPr>
+                <w:noProof/>
+                <w:webHidden/>
+              </w:rPr>
+              <w:tab/>
+            </w:r>
+            <w:r>
+              <w:rPr>
+                <w:noProof/>
+                <w:webHidden/>
+              </w:rPr>
+              <w:fldChar w:fldCharType="begin"/>
+            </w:r>
+            <w:r>
+              <w:rPr>
+                <w:noProof/>
+                <w:webHidden/>
+              </w:rPr>
+              <w:instrText xml:space="preserve"> PAGEREF _Toc225429871 \h </w:instrText>
+            </w:r>
+            <w:r>
+              <w:rPr>
+                <w:noProof/>
+                <w:webHidden/>
+              </w:rPr>
+            </w:r>
+            <w:r>
+              <w:rPr>
+                <w:noProof/>
+                <w:webHidden/>
+              </w:rPr>
+              <w:fldChar w:fldCharType="separate"/>
+            </w:r>
+            <w:r>
+              <w:rPr>
+                <w:noProof/>
+                <w:webHidden/>
+              </w:rPr>
+              <w:t>2</w:t>
+            </w:r>
+            <w:r>
+              <w:rPr>
+                <w:noProof/>
+                <w:webHidden/>
+              </w:rPr>
+              <w:fldChar w:fldCharType="end"/>
+            </w:r>
+          </w:hyperlink>
+        </w:p>
+        <w:p>
+          <w:pPr>
+            <w:pStyle w:val="TM2"/>
+            <w:tabs>
+              <w:tab w:val="right" w:leader="dot" w:pos="9062"/>
+            </w:tabs>
+            <w:rPr>
+              <w:noProof/>
+            </w:rPr>
+          </w:pPr>
+          <w:hyperlink w:anchor="_Toc225429872" w:history="1">
+            <w:r>
+              <w:rPr>
+                <w:rStyle w:val="Lienhypertexte"/>
+                <w:noProof/>
+              </w:rPr>
+              <w:t>1.2 Nouvelles Optimisation SQL</w:t>
+            </w:r>
+            <w:r>
+              <w:rPr>
+                <w:noProof/>
+                <w:webHidden/>
+              </w:rPr>
+              <w:tab/>
+            </w:r>
+            <w:r>
+              <w:rPr>
+                <w:noProof/>
+                <w:webHidden/>
+              </w:rPr>
+              <w:fldChar w:fldCharType="begin"/>
+            </w:r>
+            <w:r>
+              <w:rPr>
+                <w:noProof/>
+                <w:webHidden/>
+              </w:rPr>
+              <w:instrText xml:space="preserve"> PAGEREF _Toc225429872 \h </w:instrText>
+            </w:r>
+            <w:r>
+              <w:rPr>
+                <w:noProof/>
+                <w:webHidden/>
+              </w:rPr>
+            </w:r>
+            <w:r>
+              <w:rPr>
+                <w:noProof/>
+                <w:webHidden/>
+              </w:rPr>
+              <w:fldChar w:fldCharType="separate"/>
+            </w:r>
+            <w:r>
+              <w:rPr>
+                <w:noProof/>
+                <w:webHidden/>
+              </w:rPr>
+              <w:t>2</w:t>
+            </w:r>
+            <w:r>
+              <w:rPr>
+                <w:noProof/>
+                <w:webHidden/>
+              </w:rPr>
+              <w:fldChar w:fldCharType="end"/>
+            </w:r>
+          </w:hyperlink>
+        </w:p>
+        <w:p>
+          <w:pPr>
+            <w:pStyle w:val="TM3"/>
+            <w:tabs>
+              <w:tab w:val="right" w:leader="dot" w:pos="9062"/>
+            </w:tabs>
+            <w:rPr>
+              <w:noProof/>
+            </w:rPr>
+          </w:pPr>
+          <w:hyperlink w:anchor="_Toc225429873" w:history="1">
+            <w:r>
+              <w:rPr>
+                <w:rStyle w:val="Lienhypertexte"/>
+                <w:noProof/>
+              </w:rPr>
+              <w:t>A) Index manquant sur placement.id_devoir</w:t>
+            </w:r>
+            <w:r>
+              <w:rPr>
+                <w:noProof/>
+                <w:webHidden/>
+              </w:rPr>
+              <w:tab/>
+            </w:r>
+            <w:r>
+              <w:rPr>
+                <w:noProof/>
+                <w:webHidden/>
+              </w:rPr>
+              <w:fldChar w:fldCharType="begin"/>
+            </w:r>
+            <w:r>
+              <w:rPr>
+                <w:noProof/>
+                <w:webHidden/>
+              </w:rPr>
+              <w:instrText xml:space="preserve"> PAGEREF _Toc225429873 \h </w:instrText>
+            </w:r>
+            <w:r>
+              <w:rPr>
+                <w:noProof/>
+                <w:webHidden/>
+              </w:rPr>
+            </w:r>
+            <w:r>
+              <w:rPr>
+                <w:noProof/>
+                <w:webHidden/>
+              </w:rPr>
+              <w:fldChar w:fldCharType="separate"/>
+            </w:r>
+            <w:r>
+              <w:rPr>
+                <w:noProof/>
+                <w:webHidden/>
+              </w:rPr>
+              <w:t>2</w:t>
+            </w:r>
+            <w:r>
+              <w:rPr>
+                <w:noProof/>
+                <w:webHidden/>
+              </w:rPr>
+              <w:fldChar w:fldCharType="end"/>
+            </w:r>
+          </w:hyperlink>
+        </w:p>
+        <w:p>
+          <w:pPr>
+            <w:pStyle w:val="TM3"/>
+            <w:tabs>
+              <w:tab w:val="right" w:leader="dot" w:pos="9062"/>
+            </w:tabs>
+            <w:rPr>
+              <w:noProof/>
+            </w:rPr>
+          </w:pPr>
+          <w:hyperlink w:anchor="_Toc225429874" w:history="1">
+            <w:r>
+              <w:rPr>
+                <w:rStyle w:val="Lienhypertexte"/>
+                <w:noProof/>
+              </w:rPr>
+              <w:t>B) Normalisation incomplète</w:t>
+            </w:r>
+            <w:r>
+              <w:rPr>
+                <w:noProof/>
+                <w:webHidden/>
+              </w:rPr>
+              <w:tab/>
+            </w:r>
+            <w:r>
+              <w:rPr>
+                <w:noProof/>
+                <w:webHidden/>
+              </w:rPr>
+              <w:fldChar w:fldCharType="begin"/>
+            </w:r>
+            <w:r>
+              <w:rPr>
+                <w:noProof/>
+                <w:webHidden/>
+              </w:rPr>
+              <w:instrText xml:space="preserve"> PAGEREF _Toc225429874 \h </w:instrText>
+            </w:r>
+            <w:r>
+              <w:rPr>
+                <w:noProof/>
+                <w:webHidden/>
+              </w:rPr>
+            </w:r>
+            <w:r>
+              <w:rPr>
+                <w:noProof/>
+                <w:webHidden/>
+              </w:rPr>
+              <w:fldChar w:fldCharType="separate"/>
+            </w:r>
+            <w:r>
+              <w:rPr>
+                <w:noProof/>
+                <w:webHidden/>
+              </w:rPr>
+              <w:t>3</w:t>
+            </w:r>
+            <w:r>
+              <w:rPr>
+                <w:noProof/>
+                <w:webHidden/>
+              </w:rPr>
+              <w:fldChar w:fldCharType="end"/>
+            </w:r>
+          </w:hyperlink>
+        </w:p>
+        <w:p>
+          <w:pPr>
+            <w:pStyle w:val="TM2"/>
+            <w:tabs>
+              <w:tab w:val="right" w:leader="dot" w:pos="9062"/>
+            </w:tabs>
+            <w:rPr>
+              <w:noProof/>
+            </w:rPr>
+          </w:pPr>
+          <w:hyperlink w:anchor="_Toc225429875" w:history="1">
+            <w:r>
+              <w:rPr>
+                <w:rStyle w:val="Lienhypertexte"/>
+                <w:noProof/>
+              </w:rPr>
+              <w:t>1.3 PHP</w:t>
+            </w:r>
+            <w:r>
+              <w:rPr>
+                <w:noProof/>
+                <w:webHidden/>
+              </w:rPr>
+              <w:tab/>
+            </w:r>
+            <w:r>
+              <w:rPr>
+                <w:noProof/>
+                <w:webHidden/>
+              </w:rPr>
+              <w:fldChar w:fldCharType="begin"/>
+            </w:r>
+            <w:r>
+              <w:rPr>
+                <w:noProof/>
+                <w:webHidden/>
+              </w:rPr>
+              <w:instrText xml:space="preserve"> PAGEREF _Toc225429875 \h </w:instrText>
+            </w:r>
+            <w:r>
+              <w:rPr>
+                <w:noProof/>
+                <w:webHidden/>
+              </w:rPr>
+            </w:r>
+            <w:r>
+              <w:rPr>
+                <w:noProof/>
+                <w:webHidden/>
+              </w:rPr>
+              <w:fldChar w:fldCharType="separate"/>
+            </w:r>
+            <w:r>
+              <w:rPr>
+                <w:noProof/>
+                <w:webHidden/>
+              </w:rPr>
+              <w:t>3</w:t>
+            </w:r>
+            <w:r>
+              <w:rPr>
+                <w:noProof/>
+                <w:webHidden/>
+              </w:rPr>
+              <w:fldChar w:fldCharType="end"/>
+            </w:r>
+          </w:hyperlink>
+        </w:p>
+        <w:p>
+          <w:pPr>
+            <w:pStyle w:val="TM3"/>
+            <w:tabs>
+              <w:tab w:val="right" w:leader="dot" w:pos="9062"/>
+            </w:tabs>
+            <w:rPr>
+              <w:noProof/>
+            </w:rPr>
+          </w:pPr>
+          <w:hyperlink w:anchor="_Toc225429876" w:history="1">
+            <w:r>
+              <w:rPr>
+                <w:rStyle w:val="Lienhypertexte"/>
+                <w:noProof/>
+              </w:rPr>
+              <w:t>A) Connexion PDO</w:t>
+            </w:r>
+            <w:r>
+              <w:rPr>
+                <w:noProof/>
+                <w:webHidden/>
+              </w:rPr>
+              <w:tab/>
+            </w:r>
+            <w:r>
+              <w:rPr>
+                <w:noProof/>
+                <w:webHidden/>
+              </w:rPr>
+              <w:fldChar w:fldCharType="begin"/>
+            </w:r>
+            <w:r>
+              <w:rPr>
+                <w:noProof/>
+                <w:webHidden/>
+              </w:rPr>
+              <w:instrText xml:space="preserve"> PAGEREF _Toc225429876 \h </w:instrText>
+            </w:r>
+            <w:r>
+              <w:rPr>
+                <w:noProof/>
+                <w:webHidden/>
+              </w:rPr>
+            </w:r>
+            <w:r>
+              <w:rPr>
+                <w:noProof/>
+                <w:webHidden/>
+              </w:rPr>
+              <w:fldChar w:fldCharType="separate"/>
+            </w:r>
+            <w:r>
+              <w:rPr>
+                <w:noProof/>
+                <w:webHidden/>
+              </w:rPr>
+              <w:t>3</w:t>
+            </w:r>
+            <w:r>
+              <w:rPr>
+                <w:noProof/>
+                <w:webHidden/>
+              </w:rPr>
+              <w:fldChar w:fldCharType="end"/>
+            </w:r>
+          </w:hyperlink>
+        </w:p>
+        <w:p>
+          <w:pPr>
+            <w:pStyle w:val="TM3"/>
+            <w:tabs>
+              <w:tab w:val="right" w:leader="dot" w:pos="9062"/>
+            </w:tabs>
+            <w:rPr>
+              <w:noProof/>
+            </w:rPr>
+          </w:pPr>
+          <w:hyperlink w:anchor="_Toc225429877" w:history="1">
+            <w:r>
+              <w:rPr>
+                <w:rStyle w:val="Lienhypertexte"/>
+                <w:noProof/>
+              </w:rPr>
+              <w:t>B) Injection SQL</w:t>
+            </w:r>
+            <w:r>
+              <w:rPr>
+                <w:noProof/>
+                <w:webHidden/>
+              </w:rPr>
+              <w:tab/>
+            </w:r>
+            <w:r>
+              <w:rPr>
+                <w:noProof/>
+                <w:webHidden/>
+              </w:rPr>
+              <w:fldChar w:fldCharType="begin"/>
+            </w:r>
+            <w:r>
+              <w:rPr>
+                <w:noProof/>
+                <w:webHidden/>
+              </w:rPr>
+              <w:instrText xml:space="preserve"> PAGEREF _Toc225429877 \h </w:instrText>
+            </w:r>
+            <w:r>
+              <w:rPr>
+                <w:noProof/>
+                <w:webHidden/>
+              </w:rPr>
+            </w:r>
+            <w:r>
+              <w:rPr>
+                <w:noProof/>
+                <w:webHidden/>
+              </w:rPr>
+              <w:fldChar w:fldCharType="separate"/>
+            </w:r>
+            <w:r>
+              <w:rPr>
+                <w:noProof/>
+                <w:webHidden/>
+              </w:rPr>
+              <w:t>4</w:t>
+            </w:r>
+            <w:r>
+              <w:rPr>
+                <w:noProof/>
+                <w:webHidden/>
+              </w:rPr>
+              <w:fldChar w:fldCharType="end"/>
+            </w:r>
+          </w:hyperlink>
+        </w:p>
+        <w:p>
+          <w:pPr>
+            <w:pStyle w:val="TM3"/>
+            <w:tabs>
+              <w:tab w:val="right" w:leader="dot" w:pos="9062"/>
+            </w:tabs>
+            <w:rPr>
+              <w:noProof/>
+            </w:rPr>
+          </w:pPr>
+          <w:hyperlink w:anchor="_Toc225429878" w:history="1">
+            <w:r>
+              <w:rPr>
+                <w:rStyle w:val="Lienhypertexte"/>
+                <w:noProof/>
+              </w:rPr>
+              <w:t>C) Hachage</w:t>
+            </w:r>
+            <w:r>
+              <w:rPr>
+                <w:noProof/>
+                <w:webHidden/>
+              </w:rPr>
+              <w:tab/>
+            </w:r>
+            <w:r>
+              <w:rPr>
+                <w:noProof/>
+                <w:webHidden/>
+              </w:rPr>
+              <w:fldChar w:fldCharType="begin"/>
+            </w:r>
+            <w:r>
+              <w:rPr>
+                <w:noProof/>
+                <w:webHidden/>
+              </w:rPr>
+              <w:instrText xml:space="preserve"> PAGEREF _Toc225429878 \h </w:instrText>
+            </w:r>
+            <w:r>
+              <w:rPr>
+                <w:noProof/>
+                <w:webHidden/>
+              </w:rPr>
+            </w:r>
+            <w:r>
+              <w:rPr>
+                <w:noProof/>
+                <w:webHidden/>
+              </w:rPr>
+              <w:fldChar w:fldCharType="separate"/>
+            </w:r>
+            <w:r>
+              <w:rPr>
+                <w:noProof/>
+                <w:webHidden/>
+              </w:rPr>
+              <w:t>4</w:t>
+            </w:r>
+            <w:r>
+              <w:rPr>
+                <w:noProof/>
+                <w:webHidden/>
+              </w:rPr>
+              <w:fldChar w:fldCharType="end"/>
+            </w:r>
+          </w:hyperlink>
+        </w:p>
+        <w:p>
+          <w:pPr>
+            <w:pStyle w:val="TM3"/>
+            <w:tabs>
+              <w:tab w:val="right" w:leader="dot" w:pos="9062"/>
+            </w:tabs>
+            <w:rPr>
+              <w:noProof/>
+            </w:rPr>
+          </w:pPr>
+          <w:hyperlink w:anchor="_Toc225429879" w:history="1">
+            <w:r>
+              <w:rPr>
+                <w:rStyle w:val="Lienhypertexte"/>
+                <w:noProof/>
+              </w:rPr>
+              <w:t>D) Scripts ajoutés</w:t>
+            </w:r>
+            <w:r>
+              <w:rPr>
+                <w:noProof/>
+                <w:webHidden/>
+              </w:rPr>
+              <w:tab/>
+            </w:r>
+            <w:r>
+              <w:rPr>
+                <w:noProof/>
+                <w:webHidden/>
+              </w:rPr>
+              <w:fldChar w:fldCharType="begin"/>
+            </w:r>
+            <w:r>
+              <w:rPr>
+                <w:noProof/>
+                <w:webHidden/>
+              </w:rPr>
+              <w:instrText xml:space="preserve"> PAGEREF _Toc225429879 \h </w:instrText>
+            </w:r>
+            <w:r>
+              <w:rPr>
+                <w:noProof/>
+                <w:webHidden/>
+              </w:rPr>
+            </w:r>
+            <w:r>
+              <w:rPr>
+                <w:noProof/>
+                <w:webHidden/>
+              </w:rPr>
+              <w:fldChar w:fldCharType="separate"/>
+            </w:r>
+            <w:r>
+              <w:rPr>
+                <w:noProof/>
+                <w:webHidden/>
+              </w:rPr>
+              <w:t>4</w:t>
+            </w:r>
+            <w:r>
+              <w:rPr>
+                <w:noProof/>
+                <w:webHidden/>
+              </w:rPr>
+              <w:fldChar w:fldCharType="end"/>
+            </w:r>
+          </w:hyperlink>
+        </w:p>
+        <w:p>
+          <w:pPr>
+            <w:pStyle w:val="TM1"/>
+            <w:tabs>
+              <w:tab w:val="right" w:leader="dot" w:pos="9062"/>
+            </w:tabs>
+            <w:rPr>
+              <w:noProof/>
+            </w:rPr>
+          </w:pPr>
+          <w:hyperlink w:anchor="_Toc225429880" w:history="1">
+            <w:r>
+              <w:rPr>
+                <w:rStyle w:val="Lienhypertexte"/>
+                <w:noProof/>
+              </w:rPr>
+              <w:t>2. Planning prévisionnel pour la semaine suivante (23 au 27 Mars)</w:t>
+            </w:r>
+            <w:r>
+              <w:rPr>
+                <w:noProof/>
+                <w:webHidden/>
+              </w:rPr>
+              <w:tab/>
+            </w:r>
+            <w:r>
+              <w:rPr>
+                <w:noProof/>
+                <w:webHidden/>
+              </w:rPr>
+              <w:fldChar w:fldCharType="begin"/>
+            </w:r>
+            <w:r>
+              <w:rPr>
+                <w:noProof/>
+                <w:webHidden/>
+              </w:rPr>
+              <w:instrText xml:space="preserve"> PAGEREF _Toc225429880 \h </w:instrText>
+            </w:r>
+            <w:r>
+              <w:rPr>
+                <w:noProof/>
+                <w:webHidden/>
+              </w:rPr>
+            </w:r>
+            <w:r>
+              <w:rPr>
+                <w:noProof/>
+                <w:webHidden/>
+              </w:rPr>
+              <w:fldChar w:fldCharType="separate"/>
+            </w:r>
+            <w:r>
+              <w:rPr>
+                <w:noProof/>
+                <w:webHidden/>
+              </w:rPr>
+              <w:t>5</w:t>
+            </w:r>
+            <w:r>
+              <w:rPr>
+                <w:noProof/>
+                <w:webHidden/>
+              </w:rPr>
+              <w:fldChar w:fldCharType="end"/>
+            </w:r>
+          </w:hyperlink>
+        </w:p>
+        <w:p>
+          <w:r>
+            <w:rPr>
+              <w:b/>
+              <w:bCs/>
+            </w:rPr>
+            <w:fldChar w:fldCharType="end"/>
+          </w:r>
+        </w:p>
+      </w:sdtContent>
+    </w:sdt>
     <w:p>
       <w:pPr>
         <w:rPr>
@@ -240,124 +1174,14 @@
     </w:p>
     <w:p>
       <w:pPr>
-        <w:rPr>
-          <w:sz w:val="22"/>
-          <w:szCs w:val="22"/>
-        </w:rPr>
-      </w:pPr>
-    </w:p>
-    <w:p>
-      <w:pPr>
-        <w:rPr>
-          <w:sz w:val="22"/>
-          <w:szCs w:val="22"/>
-        </w:rPr>
-      </w:pPr>
-    </w:p>
-    <w:p>
-      <w:pPr>
-        <w:rPr>
-          <w:sz w:val="22"/>
-          <w:szCs w:val="22"/>
-        </w:rPr>
-      </w:pPr>
-    </w:p>
-    <w:p>
-      <w:pPr>
-        <w:rPr>
-          <w:sz w:val="22"/>
-          <w:szCs w:val="22"/>
-        </w:rPr>
-      </w:pPr>
-    </w:p>
-    <w:p>
-      <w:pPr>
-        <w:rPr>
-          <w:sz w:val="22"/>
-          <w:szCs w:val="22"/>
-        </w:rPr>
-      </w:pPr>
-    </w:p>
-    <w:p>
-      <w:pPr>
-        <w:rPr>
-          <w:sz w:val="22"/>
-          <w:szCs w:val="22"/>
-        </w:rPr>
-      </w:pPr>
-    </w:p>
-    <w:p>
-      <w:pPr>
-        <w:rPr>
-          <w:sz w:val="22"/>
-          <w:szCs w:val="22"/>
-        </w:rPr>
-      </w:pPr>
-    </w:p>
-    <w:p>
-      <w:pPr>
-        <w:rPr>
-          <w:sz w:val="22"/>
-          <w:szCs w:val="22"/>
-        </w:rPr>
-      </w:pPr>
-    </w:p>
-    <w:p>
-      <w:pPr>
-        <w:rPr>
-          <w:sz w:val="22"/>
-          <w:szCs w:val="22"/>
-        </w:rPr>
-      </w:pPr>
-    </w:p>
-    <w:p>
-      <w:pPr>
-        <w:rPr>
-          <w:sz w:val="22"/>
-          <w:szCs w:val="22"/>
-        </w:rPr>
-      </w:pPr>
-    </w:p>
-    <w:p>
-      <w:pPr>
-        <w:rPr>
-          <w:sz w:val="22"/>
-          <w:szCs w:val="22"/>
-        </w:rPr>
-      </w:pPr>
-    </w:p>
-    <w:p>
-      <w:pPr>
-        <w:rPr>
-          <w:sz w:val="22"/>
-          <w:szCs w:val="22"/>
-        </w:rPr>
-      </w:pPr>
-    </w:p>
-    <w:p>
-      <w:pPr>
-        <w:rPr>
-          <w:sz w:val="22"/>
-          <w:szCs w:val="22"/>
-        </w:rPr>
-      </w:pPr>
-    </w:p>
-    <w:p>
-      <w:pPr>
-        <w:rPr>
-          <w:sz w:val="22"/>
-          <w:szCs w:val="22"/>
-        </w:rPr>
-      </w:pPr>
-    </w:p>
-    <w:p>
-      <w:pPr>
         <w:pStyle w:val="Titre1"/>
       </w:pPr>
+      <w:bookmarkStart w:id="0" w:name="_Toc225429868"/>
       <w:r>
         <w:lastRenderedPageBreak/>
         <w:t>1. Bilan du travail de la semaine (16 au 20 Mars)</w:t>
       </w:r>
+      <w:bookmarkEnd w:id="0"/>
     </w:p>
     <w:p>
       <w:pPr>
@@ -365,8 +1189,12 @@
       </w:pPr>
       <w:r>
         <w:tab/>
+      </w:r>
+      <w:bookmarkStart w:id="1" w:name="_Toc225429869"/>
+      <w:r>
         <w:t>1.1 Finalisation de la BDD</w:t>
       </w:r>
+      <w:bookmarkEnd w:id="1"/>
     </w:p>
     <w:p>
       <w:pPr>
@@ -380,9 +1208,11 @@
       <w:pPr>
         <w:pStyle w:val="Titre3"/>
       </w:pPr>
+      <w:bookmarkStart w:id="2" w:name="_Toc225429870"/>
       <w:r>
         <w:t>A) Table Examen</w:t>
       </w:r>
+      <w:bookmarkEnd w:id="2"/>
     </w:p>
     <w:p>
       <w:pPr>
@@ -542,6 +1372,7 @@
           <w:rFonts w:eastAsiaTheme="minorHAnsi"/>
         </w:rPr>
       </w:pPr>
+      <w:bookmarkStart w:id="3" w:name="_Toc225429871"/>
       <w:r>
         <w:t xml:space="preserve">B) </w:t>
       </w:r>
@@ -551,6 +1382,7 @@
         </w:rPr>
         <w:t>Point de vigilance</w:t>
       </w:r>
+      <w:bookmarkEnd w:id="3"/>
     </w:p>
     <w:p>
       <w:pPr>
@@ -615,19 +1447,25 @@
       </w:pPr>
       <w:r>
         <w:tab/>
+      </w:r>
+      <w:bookmarkStart w:id="4" w:name="_Toc225429872"/>
+      <w:r>
         <w:t>1.2 Nouvelles Optimisation SQL</w:t>
       </w:r>
+      <w:bookmarkEnd w:id="4"/>
     </w:p>
     <w:p>
       <w:pPr>
         <w:pStyle w:val="Titre3"/>
       </w:pPr>
+      <w:bookmarkStart w:id="5" w:name="_Toc225429873"/>
       <w:r>
         <w:t xml:space="preserve">A) </w:t>
       </w:r>
       <w:r>
         <w:t>Index manquant sur placement.id_devoir</w:t>
       </w:r>
+      <w:bookmarkEnd w:id="5"/>
     </w:p>
     <w:p>
       <w:pPr>
@@ -659,13 +1497,7 @@
       </w:r>
       <w:proofErr w:type="spellEnd"/>
       <w:r>
-        <w:t xml:space="preserve">). Pour requêter "tous les placements d'un examen donné" </w:t>
-      </w:r>
-      <w:r>
-        <w:t xml:space="preserve">par exemple juste </w:t>
-      </w:r>
-      <w:r>
-        <w:t xml:space="preserve">afficher le plan de salle, le moteur doit faire un full scan de la table car le préfixe de la PK est </w:t>
+        <w:t xml:space="preserve">). Pour requêter "tous les placements d'un examen donné" par exemple juste afficher le plan de salle, le moteur doit faire un full scan de la table car le préfixe de la PK est </w:t>
       </w:r>
       <w:proofErr w:type="spellStart"/>
       <w:r>
@@ -756,16 +1588,8 @@
         <w:rPr>
           <w:rFonts w:ascii="Courier New" w:hAnsi="Courier New" w:cs="Courier New"/>
         </w:rPr>
-        <w:t>`</w:t>
-      </w:r>
-      <w:proofErr w:type="gramStart"/>
-      <w:r>
-        <w:rPr>
-          <w:rFonts w:ascii="Courier New" w:hAnsi="Courier New" w:cs="Courier New"/>
-        </w:rPr>
-        <w:t>);</w:t>
-      </w:r>
-      <w:proofErr w:type="gramEnd"/>
+        <w:t>`);</w:t>
+      </w:r>
     </w:p>
     <w:p>
       <w:pPr>
@@ -791,11 +1615,13 @@
         <w:pStyle w:val="text"/>
         <w:rPr>
           <w:rFonts w:ascii="Courier New" w:hAnsi="Courier New" w:cs="Courier New"/>
-        </w:rPr>
-      </w:pPr>
-      <w:r>
-        <w:rPr>
-          <w:rFonts w:ascii="Courier New" w:hAnsi="Courier New" w:cs="Courier New"/>
+          <w:lang w:val="en-US"/>
+        </w:rPr>
+      </w:pPr>
+      <w:r>
+        <w:rPr>
+          <w:rFonts w:ascii="Courier New" w:hAnsi="Courier New" w:cs="Courier New"/>
+          <w:lang w:val="en-US"/>
         </w:rPr>
         <w:t xml:space="preserve">SELECT * FROM placement WHERE </w:t>
       </w:r>
@@ -803,6 +1629,7 @@
       <w:r>
         <w:rPr>
           <w:rFonts w:ascii="Courier New" w:hAnsi="Courier New" w:cs="Courier New"/>
+          <w:lang w:val="en-US"/>
         </w:rPr>
         <w:t>id_devoir</w:t>
       </w:r>
@@ -810,6 +1637,7 @@
       <w:r>
         <w:rPr>
           <w:rFonts w:ascii="Courier New" w:hAnsi="Courier New" w:cs="Courier New"/>
+          <w:lang w:val="en-US"/>
         </w:rPr>
         <w:t xml:space="preserve"> = ?</w:t>
       </w:r>
@@ -844,19 +1672,17 @@
     </w:p>
     <w:p>
       <w:pPr>
-        <w:pStyle w:val="text"/>
-      </w:pPr>
-    </w:p>
-    <w:p>
-      <w:pPr>
         <w:pStyle w:val="Titre3"/>
       </w:pPr>
-      <w:r>
+      <w:bookmarkStart w:id="6" w:name="_Toc225429874"/>
+      <w:r>
+        <w:lastRenderedPageBreak/>
         <w:t xml:space="preserve">B) </w:t>
       </w:r>
       <w:r>
         <w:t>Normalisation incomplète</w:t>
       </w:r>
+      <w:bookmarkEnd w:id="6"/>
     </w:p>
     <w:p>
       <w:pPr>
@@ -1007,11 +1833,13 @@
         <w:pStyle w:val="text"/>
         <w:rPr>
           <w:rFonts w:ascii="Courier New" w:hAnsi="Courier New" w:cs="Courier New"/>
-        </w:rPr>
-      </w:pPr>
-      <w:r>
-        <w:rPr>
-          <w:rFonts w:ascii="Courier New" w:hAnsi="Courier New" w:cs="Courier New"/>
+          <w:lang w:val="en-US"/>
+        </w:rPr>
+      </w:pPr>
+      <w:r>
+        <w:rPr>
+          <w:rFonts w:ascii="Courier New" w:hAnsi="Courier New" w:cs="Courier New"/>
+          <w:lang w:val="en-US"/>
         </w:rPr>
         <w:t>ALTER TABLE `plan` ADD COLUMN `</w:t>
       </w:r>
@@ -1019,6 +1847,7 @@
       <w:r>
         <w:rPr>
           <w:rFonts w:ascii="Courier New" w:hAnsi="Courier New" w:cs="Courier New"/>
+          <w:lang w:val="en-US"/>
         </w:rPr>
         <w:t>capacite_max</w:t>
       </w:r>
@@ -1026,21 +1855,17 @@
       <w:r>
         <w:rPr>
           <w:rFonts w:ascii="Courier New" w:hAnsi="Courier New" w:cs="Courier New"/>
-        </w:rPr>
-        <w:t xml:space="preserve">` INT UNSIGNED NOT NULL DEFAULT </w:t>
-      </w:r>
-      <w:proofErr w:type="gramStart"/>
-      <w:r>
-        <w:rPr>
-          <w:rFonts w:ascii="Courier New" w:hAnsi="Courier New" w:cs="Courier New"/>
-        </w:rPr>
-        <w:t>0;</w:t>
-      </w:r>
-      <w:proofErr w:type="gramEnd"/>
-    </w:p>
-    <w:p>
-      <w:pPr>
-        <w:pStyle w:val="text"/>
+          <w:lang w:val="en-US"/>
+        </w:rPr>
+        <w:t>` INT UNSIGNED NOT NULL DEFAULT 0;</w:t>
+      </w:r>
+    </w:p>
+    <w:p>
+      <w:pPr>
+        <w:pStyle w:val="text"/>
+        <w:rPr>
+          <w:lang w:val="en-US"/>
+        </w:rPr>
       </w:pPr>
     </w:p>
     <w:p>
@@ -1062,11 +1887,13 @@
         <w:pStyle w:val="text"/>
         <w:rPr>
           <w:rFonts w:ascii="Courier New" w:hAnsi="Courier New" w:cs="Courier New"/>
-        </w:rPr>
-      </w:pPr>
-      <w:r>
-        <w:rPr>
-          <w:rFonts w:ascii="Courier New" w:hAnsi="Courier New" w:cs="Courier New"/>
+          <w:lang w:val="en-US"/>
+        </w:rPr>
+      </w:pPr>
+      <w:r>
+        <w:rPr>
+          <w:rFonts w:ascii="Courier New" w:hAnsi="Courier New" w:cs="Courier New"/>
+          <w:lang w:val="en-US"/>
         </w:rPr>
         <w:t>CREATE VIEW `</w:t>
       </w:r>
@@ -1074,6 +1901,7 @@
       <w:r>
         <w:rPr>
           <w:rFonts w:ascii="Courier New" w:hAnsi="Courier New" w:cs="Courier New"/>
+          <w:lang w:val="en-US"/>
         </w:rPr>
         <w:t>v_salle_capacite</w:t>
       </w:r>
@@ -1081,6 +1909,7 @@
       <w:r>
         <w:rPr>
           <w:rFonts w:ascii="Courier New" w:hAnsi="Courier New" w:cs="Courier New"/>
+          <w:lang w:val="en-US"/>
         </w:rPr>
         <w:t>` AS</w:t>
       </w:r>
@@ -1090,11 +1919,13 @@
         <w:pStyle w:val="text"/>
         <w:rPr>
           <w:rFonts w:ascii="Courier New" w:hAnsi="Courier New" w:cs="Courier New"/>
-        </w:rPr>
-      </w:pPr>
-      <w:r>
-        <w:rPr>
-          <w:rFonts w:ascii="Courier New" w:hAnsi="Courier New" w:cs="Courier New"/>
+          <w:lang w:val="en-US"/>
+        </w:rPr>
+      </w:pPr>
+      <w:r>
+        <w:rPr>
+          <w:rFonts w:ascii="Courier New" w:hAnsi="Courier New" w:cs="Courier New"/>
+          <w:lang w:val="en-US"/>
         </w:rPr>
         <w:t xml:space="preserve">  SELECT </w:t>
       </w:r>
@@ -1102,6 +1933,7 @@
       <w:r>
         <w:rPr>
           <w:rFonts w:ascii="Courier New" w:hAnsi="Courier New" w:cs="Courier New"/>
+          <w:lang w:val="en-US"/>
         </w:rPr>
         <w:t>s.id_salle</w:t>
       </w:r>
@@ -1109,6 +1941,7 @@
       <w:r>
         <w:rPr>
           <w:rFonts w:ascii="Courier New" w:hAnsi="Courier New" w:cs="Courier New"/>
+          <w:lang w:val="en-US"/>
         </w:rPr>
         <w:t xml:space="preserve">, </w:t>
       </w:r>
@@ -1116,6 +1949,7 @@
       <w:r>
         <w:rPr>
           <w:rFonts w:ascii="Courier New" w:hAnsi="Courier New" w:cs="Courier New"/>
+          <w:lang w:val="en-US"/>
         </w:rPr>
         <w:t>s.nom_salle</w:t>
       </w:r>
@@ -1123,6 +1957,7 @@
       <w:r>
         <w:rPr>
           <w:rFonts w:ascii="Courier New" w:hAnsi="Courier New" w:cs="Courier New"/>
+          <w:lang w:val="en-US"/>
         </w:rPr>
         <w:t>,</w:t>
       </w:r>
@@ -1132,83 +1967,61 @@
         <w:pStyle w:val="text"/>
         <w:rPr>
           <w:rFonts w:ascii="Courier New" w:hAnsi="Courier New" w:cs="Courier New"/>
-        </w:rPr>
-      </w:pPr>
-      <w:r>
-        <w:rPr>
-          <w:rFonts w:ascii="Courier New" w:hAnsi="Courier New" w:cs="Courier New"/>
-        </w:rPr>
-        <w:t xml:space="preserve">         </w:t>
-      </w:r>
-      <w:proofErr w:type="gramStart"/>
-      <w:r>
-        <w:rPr>
-          <w:rFonts w:ascii="Courier New" w:hAnsi="Courier New" w:cs="Courier New"/>
-        </w:rPr>
-        <w:t>IF(</w:t>
+          <w:lang w:val="en-US"/>
+        </w:rPr>
+      </w:pPr>
+      <w:r>
+        <w:rPr>
+          <w:rFonts w:ascii="Courier New" w:hAnsi="Courier New" w:cs="Courier New"/>
+          <w:lang w:val="en-US"/>
+        </w:rPr>
+        <w:t xml:space="preserve">         IF(</w:t>
       </w:r>
       <w:proofErr w:type="spellStart"/>
       <w:r>
         <w:rPr>
           <w:rFonts w:ascii="Courier New" w:hAnsi="Courier New" w:cs="Courier New"/>
+          <w:lang w:val="en-US"/>
         </w:rPr>
         <w:t>s.intercal</w:t>
       </w:r>
       <w:proofErr w:type="spellEnd"/>
-      <w:proofErr w:type="gramEnd"/>
-      <w:r>
-        <w:rPr>
-          <w:rFonts w:ascii="Courier New" w:hAnsi="Courier New" w:cs="Courier New"/>
-        </w:rPr>
-        <w:t xml:space="preserve"> = 1, </w:t>
-      </w:r>
-      <w:proofErr w:type="gramStart"/>
-      <w:r>
-        <w:rPr>
-          <w:rFonts w:ascii="Courier New" w:hAnsi="Courier New" w:cs="Courier New"/>
-        </w:rPr>
-        <w:t>FLOOR(</w:t>
+      <w:r>
+        <w:rPr>
+          <w:rFonts w:ascii="Courier New" w:hAnsi="Courier New" w:cs="Courier New"/>
+          <w:lang w:val="en-US"/>
+        </w:rPr>
+        <w:t xml:space="preserve"> = 1, FLOOR(</w:t>
       </w:r>
       <w:proofErr w:type="spellStart"/>
       <w:r>
         <w:rPr>
           <w:rFonts w:ascii="Courier New" w:hAnsi="Courier New" w:cs="Courier New"/>
-        </w:rPr>
-        <w:t>p.capacite</w:t>
-      </w:r>
-      <w:proofErr w:type="gramEnd"/>
-      <w:r>
-        <w:rPr>
-          <w:rFonts w:ascii="Courier New" w:hAnsi="Courier New" w:cs="Courier New"/>
-        </w:rPr>
-        <w:t>_max</w:t>
+          <w:lang w:val="en-US"/>
+        </w:rPr>
+        <w:t>p.capacite_max</w:t>
       </w:r>
       <w:proofErr w:type="spellEnd"/>
       <w:r>
         <w:rPr>
           <w:rFonts w:ascii="Courier New" w:hAnsi="Courier New" w:cs="Courier New"/>
+          <w:lang w:val="en-US"/>
         </w:rPr>
         <w:t xml:space="preserve"> / 2), </w:t>
       </w:r>
       <w:proofErr w:type="spellStart"/>
-      <w:proofErr w:type="gramStart"/>
-      <w:r>
-        <w:rPr>
-          <w:rFonts w:ascii="Courier New" w:hAnsi="Courier New" w:cs="Courier New"/>
-        </w:rPr>
-        <w:t>p.capacite</w:t>
-      </w:r>
-      <w:proofErr w:type="gramEnd"/>
-      <w:r>
-        <w:rPr>
-          <w:rFonts w:ascii="Courier New" w:hAnsi="Courier New" w:cs="Courier New"/>
-        </w:rPr>
-        <w:t>_max</w:t>
+      <w:r>
+        <w:rPr>
+          <w:rFonts w:ascii="Courier New" w:hAnsi="Courier New" w:cs="Courier New"/>
+          <w:lang w:val="en-US"/>
+        </w:rPr>
+        <w:t>p.capacite_max</w:t>
       </w:r>
       <w:proofErr w:type="spellEnd"/>
       <w:r>
         <w:rPr>
           <w:rFonts w:ascii="Courier New" w:hAnsi="Courier New" w:cs="Courier New"/>
+          <w:lang w:val="en-US"/>
         </w:rPr>
         <w:t xml:space="preserve">) AS </w:t>
       </w:r>
@@ -1216,6 +2029,7 @@
       <w:r>
         <w:rPr>
           <w:rFonts w:ascii="Courier New" w:hAnsi="Courier New" w:cs="Courier New"/>
+          <w:lang w:val="en-US"/>
         </w:rPr>
         <w:t>capacite_effective</w:t>
       </w:r>
@@ -1226,11 +2040,13 @@
         <w:pStyle w:val="text"/>
         <w:rPr>
           <w:rFonts w:ascii="Courier New" w:hAnsi="Courier New" w:cs="Courier New"/>
-        </w:rPr>
-      </w:pPr>
-      <w:r>
-        <w:rPr>
-          <w:rFonts w:ascii="Courier New" w:hAnsi="Courier New" w:cs="Courier New"/>
+          <w:lang w:val="en-US"/>
+        </w:rPr>
+      </w:pPr>
+      <w:r>
+        <w:rPr>
+          <w:rFonts w:ascii="Courier New" w:hAnsi="Courier New" w:cs="Courier New"/>
+          <w:lang w:val="en-US"/>
         </w:rPr>
         <w:t xml:space="preserve">  FROM salle s JOIN plan p ON </w:t>
       </w:r>
@@ -1238,6 +2054,7 @@
       <w:r>
         <w:rPr>
           <w:rFonts w:ascii="Courier New" w:hAnsi="Courier New" w:cs="Courier New"/>
+          <w:lang w:val="en-US"/>
         </w:rPr>
         <w:t>s.id_plan</w:t>
       </w:r>
@@ -1245,6 +2062,7 @@
       <w:r>
         <w:rPr>
           <w:rFonts w:ascii="Courier New" w:hAnsi="Courier New" w:cs="Courier New"/>
+          <w:lang w:val="en-US"/>
         </w:rPr>
         <w:t xml:space="preserve"> = </w:t>
       </w:r>
@@ -1252,28 +2070,25 @@
       <w:r>
         <w:rPr>
           <w:rFonts w:ascii="Courier New" w:hAnsi="Courier New" w:cs="Courier New"/>
-        </w:rPr>
-        <w:t>p.id_</w:t>
-      </w:r>
-      <w:proofErr w:type="gramStart"/>
-      <w:r>
-        <w:rPr>
-          <w:rFonts w:ascii="Courier New" w:hAnsi="Courier New" w:cs="Courier New"/>
-        </w:rPr>
-        <w:t>plan</w:t>
+          <w:lang w:val="en-US"/>
+        </w:rPr>
+        <w:t>p.id_plan</w:t>
       </w:r>
       <w:proofErr w:type="spellEnd"/>
       <w:r>
         <w:rPr>
           <w:rFonts w:ascii="Courier New" w:hAnsi="Courier New" w:cs="Courier New"/>
+          <w:lang w:val="en-US"/>
         </w:rPr>
         <w:t>;</w:t>
       </w:r>
-      <w:proofErr w:type="gramEnd"/>
-    </w:p>
-    <w:p>
-      <w:pPr>
-        <w:pStyle w:val="text"/>
+    </w:p>
+    <w:p>
+      <w:pPr>
+        <w:pStyle w:val="text"/>
+        <w:rPr>
+          <w:lang w:val="en-US"/>
+        </w:rPr>
       </w:pPr>
     </w:p>
     <w:p>
@@ -1295,19 +2110,22 @@
       </w:pPr>
       <w:r>
         <w:tab/>
-        <w:t xml:space="preserve">1.3 </w:t>
-      </w:r>
-      <w:r>
-        <w:t>PHP</w:t>
-      </w:r>
+      </w:r>
+      <w:bookmarkStart w:id="7" w:name="_Toc225429875"/>
+      <w:r>
+        <w:t>1.3 PHP</w:t>
+      </w:r>
+      <w:bookmarkEnd w:id="7"/>
     </w:p>
     <w:p>
       <w:pPr>
         <w:pStyle w:val="Titre3"/>
       </w:pPr>
+      <w:bookmarkStart w:id="8" w:name="_Toc225429876"/>
       <w:r>
         <w:t>A) Connexion PDO</w:t>
       </w:r>
+      <w:bookmarkEnd w:id="8"/>
     </w:p>
     <w:p>
       <w:pPr>
@@ -1322,7 +2140,15 @@
       </w:r>
       <w:proofErr w:type="spellEnd"/>
       <w:r>
-        <w:t>, le mdp était en dur. Nous avons donc corrigé ce problème en mettant les identifications de connexions dans un fichier à part.</w:t>
+        <w:t xml:space="preserve">, le </w:t>
+      </w:r>
+      <w:proofErr w:type="spellStart"/>
+      <w:r>
+        <w:t>mdp</w:t>
+      </w:r>
+      <w:proofErr w:type="spellEnd"/>
+      <w:r>
+        <w:t xml:space="preserve"> était en dur. Nous avons donc corrigé ce problème en mettant les identifications de connexions dans un fichier à part.</w:t>
       </w:r>
     </w:p>
     <w:p>
@@ -1338,11 +2164,7 @@
         <w:t xml:space="preserve">- </w:t>
       </w:r>
       <w:r>
-        <w:t xml:space="preserve">Credentials externalisés </w:t>
-      </w:r>
-      <w:proofErr w:type="gramStart"/>
-      <w:r>
-        <w:t>vers</w:t>
+        <w:t>Credentials externalisés vers</w:t>
       </w:r>
       <w:r>
         <w:t xml:space="preserve"> </w:t>
@@ -1350,7 +2172,6 @@
       <w:r>
         <w:t>.env</w:t>
       </w:r>
-      <w:proofErr w:type="gramEnd"/>
       <w:r>
         <w:t>, l</w:t>
       </w:r>
@@ -1363,26 +2184,13 @@
         <w:pStyle w:val="text"/>
       </w:pPr>
       <w:r>
-        <w:t xml:space="preserve">Désormais chargé via $_ENV['DB_PASS'], le </w:t>
-      </w:r>
-      <w:proofErr w:type="gramStart"/>
-      <w:r>
-        <w:t>fichier .env</w:t>
-      </w:r>
-      <w:proofErr w:type="gramEnd"/>
-      <w:r>
-        <w:t xml:space="preserve"> est ajouté </w:t>
-      </w:r>
-      <w:proofErr w:type="gramStart"/>
-      <w:r>
-        <w:t>au .</w:t>
+        <w:t>Désormais chargé via $_ENV['DB_PASS'], le fichier .env est ajouté au .</w:t>
       </w:r>
       <w:proofErr w:type="spellStart"/>
       <w:r>
         <w:t>gitignore</w:t>
       </w:r>
       <w:proofErr w:type="spellEnd"/>
-      <w:proofErr w:type="gramEnd"/>
       <w:r>
         <w:t>.</w:t>
       </w:r>
@@ -1403,15 +2211,7 @@
       </w:r>
       <w:proofErr w:type="spellEnd"/>
       <w:r>
-        <w:t xml:space="preserve">=utf8mb4 déclaré dans </w:t>
-      </w:r>
-      <w:proofErr w:type="gramStart"/>
-      <w:r>
-        <w:t>le DSN</w:t>
-      </w:r>
-      <w:proofErr w:type="gramEnd"/>
-      <w:r>
-        <w:t xml:space="preserve">. Le </w:t>
+        <w:t xml:space="preserve">=utf8mb4 déclaré dans le DSN. Le </w:t>
       </w:r>
       <w:proofErr w:type="spellStart"/>
       <w:r>
@@ -1419,15 +2219,7 @@
       </w:r>
       <w:proofErr w:type="spellEnd"/>
       <w:r>
-        <w:t xml:space="preserve"> dans </w:t>
-      </w:r>
-      <w:proofErr w:type="gramStart"/>
-      <w:r>
-        <w:t>le DSN</w:t>
-      </w:r>
-      <w:proofErr w:type="gramEnd"/>
-      <w:r>
-        <w:t xml:space="preserve"> suffit et s'applique avant l'ouverture de la connexion.</w:t>
+        <w:t xml:space="preserve"> dans le DSN suffit et s'applique avant l'ouverture de la connexion.</w:t>
       </w:r>
     </w:p>
     <w:p>
@@ -1441,41 +2233,20 @@
         <w:t>$e-&gt;</w:t>
       </w:r>
       <w:proofErr w:type="spellStart"/>
-      <w:proofErr w:type="gramStart"/>
       <w:r>
         <w:t>getMessage</w:t>
       </w:r>
       <w:proofErr w:type="spellEnd"/>
       <w:r>
-        <w:t>(</w:t>
-      </w:r>
-      <w:proofErr w:type="gramEnd"/>
-      <w:r>
-        <w:t xml:space="preserve">) retiré du </w:t>
-      </w:r>
-      <w:proofErr w:type="gramStart"/>
-      <w:r>
-        <w:t>die(</w:t>
-      </w:r>
-      <w:proofErr w:type="gramEnd"/>
-      <w:r>
-        <w:t xml:space="preserve">) Un message d'erreur technique exposé à l'utilisateur révèle le nom du serveur, la structure de la BDD, etc. Remplacé par </w:t>
+        <w:t xml:space="preserve">() retiré du die() Un message d'erreur technique exposé à l'utilisateur révèle le nom du serveur, la structure de la BDD, etc. Remplacé par </w:t>
       </w:r>
       <w:proofErr w:type="spellStart"/>
       <w:r>
-        <w:t>error_</w:t>
-      </w:r>
-      <w:proofErr w:type="gramStart"/>
-      <w:r>
-        <w:t>log</w:t>
+        <w:t>error_log</w:t>
       </w:r>
       <w:proofErr w:type="spellEnd"/>
       <w:r>
-        <w:t>(</w:t>
-      </w:r>
-      <w:proofErr w:type="gramEnd"/>
-      <w:r>
-        <w:t>) côté serveur et un message générique côté client.</w:t>
+        <w:t>() côté serveur et un message générique côté client.</w:t>
       </w:r>
     </w:p>
     <w:p>
@@ -1492,32 +2263,34 @@
       <w:pPr>
         <w:pStyle w:val="Titre3"/>
       </w:pPr>
-      <w:r>
+      <w:bookmarkStart w:id="9" w:name="_Toc225429877"/>
+      <w:r>
+        <w:t>B) Injection SQL</w:t>
+      </w:r>
+      <w:bookmarkEnd w:id="9"/>
+    </w:p>
+    <w:p>
+      <w:pPr>
+        <w:pStyle w:val="text"/>
+      </w:pPr>
+      <w:r>
+        <w:t>Suppression du mot de passe dans la clause WHERE L'ancienne requête comparait le hash directement en SQL :</w:t>
+      </w:r>
+    </w:p>
+    <w:p>
+      <w:pPr>
+        <w:pStyle w:val="text"/>
+        <w:rPr>
+          <w:rFonts w:ascii="Courier New" w:hAnsi="Courier New" w:cs="Courier New"/>
+          <w:lang w:val="en-US"/>
+        </w:rPr>
+      </w:pPr>
+      <w:r>
+        <w:rPr>
+          <w:rFonts w:ascii="Courier New" w:hAnsi="Courier New" w:cs="Courier New"/>
+          <w:lang w:val="en-US"/>
+        </w:rPr>
         <w:lastRenderedPageBreak/>
-        <w:t>B) Injection SQL</w:t>
-      </w:r>
-    </w:p>
-    <w:p>
-      <w:pPr>
-        <w:pStyle w:val="text"/>
-      </w:pPr>
-      <w:r>
-        <w:t>Suppression du mot de passe dans la clause WHERE L'ancienne requête comparait le hash directement en SQL :</w:t>
-      </w:r>
-    </w:p>
-    <w:p>
-      <w:pPr>
-        <w:pStyle w:val="text"/>
-        <w:rPr>
-          <w:rFonts w:ascii="Courier New" w:hAnsi="Courier New" w:cs="Courier New"/>
-          <w:lang w:val="en-US"/>
-        </w:rPr>
-      </w:pPr>
-      <w:r>
-        <w:rPr>
-          <w:rFonts w:ascii="Courier New" w:hAnsi="Courier New" w:cs="Courier New"/>
-          <w:lang w:val="en-US"/>
-        </w:rPr>
         <w:t xml:space="preserve">SELECT pass, admin FROM </w:t>
       </w:r>
       <w:proofErr w:type="spellStart"/>
@@ -1534,36 +2307,32 @@
           <w:rFonts w:ascii="Courier New" w:hAnsi="Courier New" w:cs="Courier New"/>
           <w:lang w:val="en-US"/>
         </w:rPr>
-        <w:t xml:space="preserve"> WHERE login </w:t>
-      </w:r>
-      <w:proofErr w:type="gramStart"/>
-      <w:r>
-        <w:rPr>
-          <w:rFonts w:ascii="Courier New" w:hAnsi="Courier New" w:cs="Courier New"/>
-          <w:lang w:val="en-US"/>
-        </w:rPr>
-        <w:t>= :login</w:t>
-      </w:r>
-      <w:proofErr w:type="gramEnd"/>
-    </w:p>
-    <w:p>
-      <w:pPr>
-        <w:pStyle w:val="text"/>
-        <w:rPr>
-          <w:rFonts w:ascii="Courier New" w:hAnsi="Courier New" w:cs="Courier New"/>
-          <w:lang w:val="en-US"/>
-        </w:rPr>
-      </w:pPr>
-    </w:p>
-    <w:p>
-      <w:pPr>
-        <w:pStyle w:val="text"/>
-      </w:pPr>
-      <w:r>
-        <w:t xml:space="preserve">BCrypt génère un </w:t>
-      </w:r>
+        <w:t xml:space="preserve"> WHERE login = :login</w:t>
+      </w:r>
+    </w:p>
+    <w:p>
+      <w:pPr>
+        <w:pStyle w:val="text"/>
+        <w:rPr>
+          <w:rFonts w:ascii="Courier New" w:hAnsi="Courier New" w:cs="Courier New"/>
+          <w:lang w:val="en-US"/>
+        </w:rPr>
+      </w:pPr>
+    </w:p>
+    <w:p>
+      <w:pPr>
+        <w:pStyle w:val="text"/>
+      </w:pPr>
       <w:proofErr w:type="spellStart"/>
       <w:r>
+        <w:t>BCrypt</w:t>
+      </w:r>
+      <w:proofErr w:type="spellEnd"/>
+      <w:r>
+        <w:t xml:space="preserve"> génère un </w:t>
+      </w:r>
+      <w:proofErr w:type="spellStart"/>
+      <w:r>
         <w:t>salt</w:t>
       </w:r>
       <w:proofErr w:type="spellEnd"/>
@@ -1588,9 +2357,11 @@
       <w:pPr>
         <w:pStyle w:val="Titre3"/>
       </w:pPr>
+      <w:bookmarkStart w:id="10" w:name="_Toc225429878"/>
       <w:r>
         <w:t>C) Hachage</w:t>
       </w:r>
+      <w:bookmarkEnd w:id="10"/>
     </w:p>
     <w:p>
       <w:pPr>
@@ -1694,70 +2465,34 @@
           <w:bCs/>
           <w:lang w:val="en-US"/>
         </w:rPr>
-        <w:t>password_</w:t>
-      </w:r>
-      <w:proofErr w:type="gramStart"/>
+        <w:t>password_hash</w:t>
+      </w:r>
+      <w:proofErr w:type="spellEnd"/>
       <w:r>
         <w:rPr>
           <w:b/>
           <w:bCs/>
           <w:lang w:val="en-US"/>
         </w:rPr>
-        <w:t>hash</w:t>
-      </w:r>
-      <w:proofErr w:type="spellEnd"/>
+        <w:t xml:space="preserve">() / </w:t>
+      </w:r>
+      <w:proofErr w:type="spellStart"/>
       <w:r>
         <w:rPr>
           <w:b/>
           <w:bCs/>
           <w:lang w:val="en-US"/>
         </w:rPr>
-        <w:t>(</w:t>
-      </w:r>
-      <w:proofErr w:type="gramEnd"/>
+        <w:t>password_verify</w:t>
+      </w:r>
+      <w:proofErr w:type="spellEnd"/>
       <w:r>
         <w:rPr>
           <w:b/>
           <w:bCs/>
           <w:lang w:val="en-US"/>
         </w:rPr>
-        <w:t xml:space="preserve">) / </w:t>
-      </w:r>
-      <w:proofErr w:type="spellStart"/>
-      <w:r>
-        <w:rPr>
-          <w:b/>
-          <w:bCs/>
-          <w:lang w:val="en-US"/>
-        </w:rPr>
-        <w:t>password_</w:t>
-      </w:r>
-      <w:proofErr w:type="gramStart"/>
-      <w:r>
-        <w:rPr>
-          <w:b/>
-          <w:bCs/>
-          <w:lang w:val="en-US"/>
-        </w:rPr>
-        <w:t>verify</w:t>
-      </w:r>
-      <w:proofErr w:type="spellEnd"/>
-      <w:r>
-        <w:rPr>
-          <w:b/>
-          <w:bCs/>
-          <w:lang w:val="en-US"/>
-        </w:rPr>
-        <w:t>(</w:t>
-      </w:r>
-      <w:proofErr w:type="gramEnd"/>
-      <w:r>
-        <w:rPr>
-          <w:b/>
-          <w:bCs/>
-          <w:lang w:val="en-US"/>
-        </w:rPr>
-        <w:t>)</w:t>
+        <w:t>()</w:t>
       </w:r>
       <w:r>
         <w:rPr>
@@ -1895,28 +2630,14 @@
               <w:rPr>
                 <w:lang w:val="en-US"/>
               </w:rPr>
-              <w:t>password_</w:t>
-            </w:r>
-            <w:proofErr w:type="gramStart"/>
+              <w:t>password_hash</w:t>
+            </w:r>
+            <w:proofErr w:type="spellEnd"/>
             <w:r>
               <w:rPr>
                 <w:lang w:val="en-US"/>
               </w:rPr>
-              <w:t>hash</w:t>
-            </w:r>
-            <w:proofErr w:type="spellEnd"/>
-            <w:r>
-              <w:rPr>
-                <w:lang w:val="en-US"/>
-              </w:rPr>
-              <w:t>(</w:t>
-            </w:r>
-            <w:proofErr w:type="gramEnd"/>
-            <w:r>
-              <w:rPr>
-                <w:lang w:val="en-US"/>
-              </w:rPr>
-              <w:t>$pass, PASSWORD_BCRYPT, ['cost' =&gt; 12])</w:t>
+              <w:t>($pass, PASSWORD_BCRYPT, ['cost' =&gt; 12])</w:t>
             </w:r>
           </w:p>
         </w:tc>
@@ -1958,28 +2679,14 @@
               <w:rPr>
                 <w:lang w:val="en-US"/>
               </w:rPr>
-              <w:t>password_</w:t>
-            </w:r>
-            <w:proofErr w:type="gramStart"/>
+              <w:t>password_verify</w:t>
+            </w:r>
+            <w:proofErr w:type="spellEnd"/>
             <w:r>
               <w:rPr>
                 <w:lang w:val="en-US"/>
               </w:rPr>
-              <w:t>verify</w:t>
-            </w:r>
-            <w:proofErr w:type="spellEnd"/>
-            <w:r>
-              <w:rPr>
-                <w:lang w:val="en-US"/>
-              </w:rPr>
-              <w:t>(</w:t>
-            </w:r>
-            <w:proofErr w:type="gramEnd"/>
-            <w:r>
-              <w:rPr>
-                <w:lang w:val="en-US"/>
-              </w:rPr>
-              <w:t>$</w:t>
+              <w:t>($</w:t>
             </w:r>
             <w:proofErr w:type="spellStart"/>
             <w:r>
@@ -2113,6 +2820,7 @@
           <w:rFonts w:eastAsiaTheme="minorHAnsi"/>
         </w:rPr>
       </w:pPr>
+      <w:bookmarkStart w:id="11" w:name="_Toc225429879"/>
       <w:r>
         <w:t xml:space="preserve">D) </w:t>
       </w:r>
@@ -2122,6 +2830,7 @@
         </w:rPr>
         <w:t>Scripts ajoutés</w:t>
       </w:r>
+      <w:bookmarkEnd w:id="11"/>
     </w:p>
     <w:p>
       <w:pPr>
@@ -2144,35 +2853,19 @@
       </w:r>
       <w:proofErr w:type="spellStart"/>
       <w:r>
-        <w:t>password_</w:t>
-      </w:r>
-      <w:proofErr w:type="gramStart"/>
-      <w:r>
-        <w:t>hash</w:t>
+        <w:t>password_hash</w:t>
       </w:r>
       <w:proofErr w:type="spellEnd"/>
       <w:r>
-        <w:t>(</w:t>
-      </w:r>
-      <w:proofErr w:type="gramEnd"/>
-      <w:r>
-        <w:t>). Protégé contre l'exécution HTTP (</w:t>
+        <w:t>(). Protégé contre l'exécution HTTP (</w:t>
       </w:r>
       <w:proofErr w:type="spellStart"/>
       <w:r>
-        <w:t>php_sapi_</w:t>
-      </w:r>
-      <w:proofErr w:type="gramStart"/>
-      <w:r>
-        <w:t>name</w:t>
+        <w:t>php_sapi_name</w:t>
       </w:r>
       <w:proofErr w:type="spellEnd"/>
       <w:r>
-        <w:t>(</w:t>
-      </w:r>
-      <w:proofErr w:type="gramEnd"/>
-      <w:r>
-        <w:t>) !== 'cli').</w:t>
+        <w:t>() !== 'cli').</w:t>
       </w:r>
     </w:p>
     <w:p>
@@ -2254,8 +2947,9 @@
       <w:pPr>
         <w:pStyle w:val="Titre1"/>
       </w:pPr>
-      <w:bookmarkStart w:id="0" w:name="_Toc223702038"/>
-      <w:bookmarkStart w:id="1" w:name="_Toc224308650"/>
+      <w:bookmarkStart w:id="12" w:name="_Toc223702038"/>
+      <w:bookmarkStart w:id="13" w:name="_Toc224308650"/>
+      <w:bookmarkStart w:id="14" w:name="_Toc225429880"/>
       <w:r>
         <w:lastRenderedPageBreak/>
         <w:t>2. Planning prévisionnel pour la semaine suivante (</w:t>
@@ -2272,8 +2966,9 @@
       <w:r>
         <w:t>Mars)</w:t>
       </w:r>
-      <w:bookmarkEnd w:id="0"/>
-      <w:bookmarkEnd w:id="1"/>
+      <w:bookmarkEnd w:id="12"/>
+      <w:bookmarkEnd w:id="13"/>
+      <w:bookmarkEnd w:id="14"/>
     </w:p>
     <w:p>
       <w:pPr>
@@ -2288,7 +2983,7 @@
       </w:r>
     </w:p>
     <w:sectPr>
-      <w:footerReference w:type="default" r:id="rId7"/>
+      <w:footerReference w:type="default" r:id="rId8"/>
       <w:pgSz w:w="11906" w:h="16838"/>
       <w:pgMar w:top="1417" w:right="1417" w:bottom="1417" w:left="1417" w:header="708" w:footer="708" w:gutter="0"/>
       <w:cols w:space="708"/>
@@ -3512,6 +4207,7 @@
   <w:style w:type="character" w:default="1" w:styleId="Policepardfaut">
     <w:name w:val="Default Paragraph Font"/>
     <w:uiPriority w:val="1"/>
+    <w:semiHidden/>
     <w:unhideWhenUsed/>
   </w:style>
   <w:style w:type="table" w:default="1" w:styleId="TableauNormal">
@@ -3907,6 +4603,77 @@
       <w:sz w:val="22"/>
     </w:rPr>
   </w:style>
+  <w:style w:type="paragraph" w:styleId="En-ttedetabledesmatires">
+    <w:name w:val="TOC Heading"/>
+    <w:basedOn w:val="Titre1"/>
+    <w:next w:val="Normal"/>
+    <w:uiPriority w:val="39"/>
+    <w:unhideWhenUsed/>
+    <w:qFormat/>
+    <w:rsid w:val="0000681C"/>
+    <w:pPr>
+      <w:spacing w:before="240" w:after="0" w:line="259" w:lineRule="auto"/>
+      <w:outlineLvl w:val="9"/>
+    </w:pPr>
+    <w:rPr>
+      <w:rFonts w:asciiTheme="majorHAnsi" w:hAnsiTheme="majorHAnsi"/>
+      <w:color w:val="0F4761" w:themeColor="accent1" w:themeShade="BF"/>
+      <w:kern w:val="0"/>
+      <w:sz w:val="32"/>
+      <w:szCs w:val="32"/>
+      <w:lang w:eastAsia="fr-FR"/>
+      <w14:ligatures w14:val="none"/>
+    </w:rPr>
+  </w:style>
+  <w:style w:type="paragraph" w:styleId="TM1">
+    <w:name w:val="toc 1"/>
+    <w:basedOn w:val="Normal"/>
+    <w:next w:val="Normal"/>
+    <w:autoRedefine/>
+    <w:uiPriority w:val="39"/>
+    <w:unhideWhenUsed/>
+    <w:rsid w:val="0000681C"/>
+    <w:pPr>
+      <w:spacing w:after="100"/>
+    </w:pPr>
+  </w:style>
+  <w:style w:type="paragraph" w:styleId="TM2">
+    <w:name w:val="toc 2"/>
+    <w:basedOn w:val="Normal"/>
+    <w:next w:val="Normal"/>
+    <w:autoRedefine/>
+    <w:uiPriority w:val="39"/>
+    <w:unhideWhenUsed/>
+    <w:rsid w:val="0000681C"/>
+    <w:pPr>
+      <w:spacing w:after="100"/>
+      <w:ind w:left="240"/>
+    </w:pPr>
+  </w:style>
+  <w:style w:type="paragraph" w:styleId="TM3">
+    <w:name w:val="toc 3"/>
+    <w:basedOn w:val="Normal"/>
+    <w:next w:val="Normal"/>
+    <w:autoRedefine/>
+    <w:uiPriority w:val="39"/>
+    <w:unhideWhenUsed/>
+    <w:rsid w:val="0000681C"/>
+    <w:pPr>
+      <w:spacing w:after="100"/>
+      <w:ind w:left="480"/>
+    </w:pPr>
+  </w:style>
+  <w:style w:type="character" w:styleId="Lienhypertexte">
+    <w:name w:val="Hyperlink"/>
+    <w:basedOn w:val="Policepardfaut"/>
+    <w:uiPriority w:val="99"/>
+    <w:unhideWhenUsed/>
+    <w:rsid w:val="0000681C"/>
+    <w:rPr>
+      <w:color w:val="467886" w:themeColor="hyperlink"/>
+      <w:u w:val="single"/>
+    </w:rPr>
+  </w:style>
 </w:styles>
 </file>
 
@@ -4223,4 +4990,16 @@
     </a:ext>
   </a:extLst>
 </a:theme>
+</file>
+
+<file path=customXml/item1.xml><?xml version="1.0" encoding="utf-8"?>
+<b:Sources xmlns:b="http://schemas.openxmlformats.org/officeDocument/2006/bibliography" xmlns="http://schemas.openxmlformats.org/officeDocument/2006/bibliography" SelectedStyle="\APASixthEditionOfficeOnline.xsl" StyleName="APA" Version="6"/>
+</file>
+
+<file path=customXml/itemProps1.xml><?xml version="1.0" encoding="utf-8"?>
+<ds:datastoreItem xmlns:ds="http://schemas.openxmlformats.org/officeDocument/2006/customXml" ds:itemID="{6998436C-92FD-4ACA-9BC7-74AA1790C975}">
+  <ds:schemaRefs>
+    <ds:schemaRef ds:uri="http://schemas.openxmlformats.org/officeDocument/2006/bibliography"/>
+  </ds:schemaRefs>
+</ds:datastoreItem>
 </file>
</xml_diff>

<commit_message>
Rapport final a completer
</commit_message>
<xml_diff>
--- a/RAPPORT semaine/s3 19-20 mars/RAPPORT s3 16-20 Mars.docx
+++ b/RAPPORT semaine/s3 19-20 mars/RAPPORT s3 16-20 Mars.docx
@@ -83,6 +83,7 @@
         </w:rPr>
         <w:tab/>
       </w:r>
+      <w:proofErr w:type="gramStart"/>
       <w:r>
         <w:rPr>
           <w:rFonts w:ascii="Arial" w:hAnsi="Arial" w:cs="Arial"/>
@@ -90,7 +91,16 @@
           <w:lang w:val="en-US"/>
         </w:rPr>
         <w:tab/>
-        <w:t xml:space="preserve">  06/03/2026</w:t>
+        <w:t xml:space="preserve">  06</w:t>
+      </w:r>
+      <w:proofErr w:type="gramEnd"/>
+      <w:r>
+        <w:rPr>
+          <w:rFonts w:ascii="Arial" w:hAnsi="Arial" w:cs="Arial"/>
+          <w:color w:val="000000"/>
+          <w:lang w:val="en-US"/>
+        </w:rPr>
+        <w:t>/03/2026</w:t>
       </w:r>
       <w:r>
         <w:rPr>
@@ -152,6 +162,15 @@
     </w:p>
     <w:sdt>
       <w:sdtPr>
+        <w:rPr>
+          <w:rFonts w:asciiTheme="minorHAnsi" w:eastAsiaTheme="minorHAnsi" w:hAnsiTheme="minorHAnsi" w:cstheme="minorBidi"/>
+          <w:color w:val="auto"/>
+          <w:kern w:val="2"/>
+          <w:sz w:val="24"/>
+          <w:szCs w:val="24"/>
+          <w:lang w:eastAsia="en-US"/>
+          <w14:ligatures w14:val="standardContextual"/>
+        </w:rPr>
         <w:id w:val="1228649451"/>
         <w:docPartObj>
           <w:docPartGallery w:val="Table of Contents"/>
@@ -160,15 +179,8 @@
       </w:sdtPr>
       <w:sdtEndPr>
         <w:rPr>
-          <w:rFonts w:asciiTheme="minorHAnsi" w:eastAsiaTheme="minorHAnsi" w:hAnsiTheme="minorHAnsi" w:cstheme="minorBidi"/>
           <w:b/>
           <w:bCs/>
-          <w:color w:val="auto"/>
-          <w:kern w:val="2"/>
-          <w:sz w:val="24"/>
-          <w:szCs w:val="24"/>
-          <w:lang w:eastAsia="en-US"/>
-          <w14:ligatures w14:val="standardContextual"/>
         </w:rPr>
       </w:sdtEndPr>
       <w:sdtContent>
@@ -1588,8 +1600,16 @@
         <w:rPr>
           <w:rFonts w:ascii="Courier New" w:hAnsi="Courier New" w:cs="Courier New"/>
         </w:rPr>
-        <w:t>`);</w:t>
-      </w:r>
+        <w:t>`</w:t>
+      </w:r>
+      <w:proofErr w:type="gramStart"/>
+      <w:r>
+        <w:rPr>
+          <w:rFonts w:ascii="Courier New" w:hAnsi="Courier New" w:cs="Courier New"/>
+        </w:rPr>
+        <w:t>);</w:t>
+      </w:r>
+      <w:proofErr w:type="gramEnd"/>
     </w:p>
     <w:p>
       <w:pPr>
@@ -1639,8 +1659,17 @@
           <w:rFonts w:ascii="Courier New" w:hAnsi="Courier New" w:cs="Courier New"/>
           <w:lang w:val="en-US"/>
         </w:rPr>
-        <w:t xml:space="preserve"> = ?</w:t>
-      </w:r>
+        <w:t xml:space="preserve"> </w:t>
+      </w:r>
+      <w:proofErr w:type="gramStart"/>
+      <w:r>
+        <w:rPr>
+          <w:rFonts w:ascii="Courier New" w:hAnsi="Courier New" w:cs="Courier New"/>
+          <w:lang w:val="en-US"/>
+        </w:rPr>
+        <w:t>= ?</w:t>
+      </w:r>
+      <w:proofErr w:type="gramEnd"/>
     </w:p>
     <w:p>
       <w:pPr>
@@ -1857,8 +1886,17 @@
           <w:rFonts w:ascii="Courier New" w:hAnsi="Courier New" w:cs="Courier New"/>
           <w:lang w:val="en-US"/>
         </w:rPr>
-        <w:t>` INT UNSIGNED NOT NULL DEFAULT 0;</w:t>
-      </w:r>
+        <w:t xml:space="preserve">` INT UNSIGNED NOT NULL DEFAULT </w:t>
+      </w:r>
+      <w:proofErr w:type="gramStart"/>
+      <w:r>
+        <w:rPr>
+          <w:rFonts w:ascii="Courier New" w:hAnsi="Courier New" w:cs="Courier New"/>
+          <w:lang w:val="en-US"/>
+        </w:rPr>
+        <w:t>0;</w:t>
+      </w:r>
+      <w:proofErr w:type="gramEnd"/>
     </w:p>
     <w:p>
       <w:pPr>
@@ -1975,7 +2013,15 @@
           <w:rFonts w:ascii="Courier New" w:hAnsi="Courier New" w:cs="Courier New"/>
           <w:lang w:val="en-US"/>
         </w:rPr>
-        <w:t xml:space="preserve">         IF(</w:t>
+        <w:t xml:space="preserve">         </w:t>
+      </w:r>
+      <w:proofErr w:type="gramStart"/>
+      <w:r>
+        <w:rPr>
+          <w:rFonts w:ascii="Courier New" w:hAnsi="Courier New" w:cs="Courier New"/>
+          <w:lang w:val="en-US"/>
+        </w:rPr>
+        <w:t>IF(</w:t>
       </w:r>
       <w:proofErr w:type="spellStart"/>
       <w:r>
@@ -1986,12 +2032,21 @@
         <w:t>s.intercal</w:t>
       </w:r>
       <w:proofErr w:type="spellEnd"/>
-      <w:r>
-        <w:rPr>
-          <w:rFonts w:ascii="Courier New" w:hAnsi="Courier New" w:cs="Courier New"/>
-          <w:lang w:val="en-US"/>
-        </w:rPr>
-        <w:t xml:space="preserve"> = 1, FLOOR(</w:t>
+      <w:proofErr w:type="gramEnd"/>
+      <w:r>
+        <w:rPr>
+          <w:rFonts w:ascii="Courier New" w:hAnsi="Courier New" w:cs="Courier New"/>
+          <w:lang w:val="en-US"/>
+        </w:rPr>
+        <w:t xml:space="preserve"> = 1, </w:t>
+      </w:r>
+      <w:proofErr w:type="gramStart"/>
+      <w:r>
+        <w:rPr>
+          <w:rFonts w:ascii="Courier New" w:hAnsi="Courier New" w:cs="Courier New"/>
+          <w:lang w:val="en-US"/>
+        </w:rPr>
+        <w:t>FLOOR(</w:t>
       </w:r>
       <w:proofErr w:type="spellStart"/>
       <w:r>
@@ -1999,7 +2054,15 @@
           <w:rFonts w:ascii="Courier New" w:hAnsi="Courier New" w:cs="Courier New"/>
           <w:lang w:val="en-US"/>
         </w:rPr>
-        <w:t>p.capacite_max</w:t>
+        <w:t>p.capacite</w:t>
+      </w:r>
+      <w:proofErr w:type="gramEnd"/>
+      <w:r>
+        <w:rPr>
+          <w:rFonts w:ascii="Courier New" w:hAnsi="Courier New" w:cs="Courier New"/>
+          <w:lang w:val="en-US"/>
+        </w:rPr>
+        <w:t>_max</w:t>
       </w:r>
       <w:proofErr w:type="spellEnd"/>
       <w:r>
@@ -2010,12 +2073,21 @@
         <w:t xml:space="preserve"> / 2), </w:t>
       </w:r>
       <w:proofErr w:type="spellStart"/>
-      <w:r>
-        <w:rPr>
-          <w:rFonts w:ascii="Courier New" w:hAnsi="Courier New" w:cs="Courier New"/>
-          <w:lang w:val="en-US"/>
-        </w:rPr>
-        <w:t>p.capacite_max</w:t>
+      <w:proofErr w:type="gramStart"/>
+      <w:r>
+        <w:rPr>
+          <w:rFonts w:ascii="Courier New" w:hAnsi="Courier New" w:cs="Courier New"/>
+          <w:lang w:val="en-US"/>
+        </w:rPr>
+        <w:t>p.capacite</w:t>
+      </w:r>
+      <w:proofErr w:type="gramEnd"/>
+      <w:r>
+        <w:rPr>
+          <w:rFonts w:ascii="Courier New" w:hAnsi="Courier New" w:cs="Courier New"/>
+          <w:lang w:val="en-US"/>
+        </w:rPr>
+        <w:t>_max</w:t>
       </w:r>
       <w:proofErr w:type="spellEnd"/>
       <w:r>
@@ -2072,7 +2144,15 @@
           <w:rFonts w:ascii="Courier New" w:hAnsi="Courier New" w:cs="Courier New"/>
           <w:lang w:val="en-US"/>
         </w:rPr>
-        <w:t>p.id_plan</w:t>
+        <w:t>p.id_</w:t>
+      </w:r>
+      <w:proofErr w:type="gramStart"/>
+      <w:r>
+        <w:rPr>
+          <w:rFonts w:ascii="Courier New" w:hAnsi="Courier New" w:cs="Courier New"/>
+          <w:lang w:val="en-US"/>
+        </w:rPr>
+        <w:t>plan</w:t>
       </w:r>
       <w:proofErr w:type="spellEnd"/>
       <w:r>
@@ -2082,6 +2162,7 @@
         </w:rPr>
         <w:t>;</w:t>
       </w:r>
+      <w:proofErr w:type="gramEnd"/>
     </w:p>
     <w:p>
       <w:pPr>
@@ -2164,7 +2245,11 @@
         <w:t xml:space="preserve">- </w:t>
       </w:r>
       <w:r>
-        <w:t>Credentials externalisés vers</w:t>
+        <w:t xml:space="preserve">Credentials externalisés </w:t>
+      </w:r>
+      <w:proofErr w:type="gramStart"/>
+      <w:r>
+        <w:t>vers</w:t>
       </w:r>
       <w:r>
         <w:t xml:space="preserve"> </w:t>
@@ -2172,6 +2257,7 @@
       <w:r>
         <w:t>.env</w:t>
       </w:r>
+      <w:proofErr w:type="gramEnd"/>
       <w:r>
         <w:t>, l</w:t>
       </w:r>
@@ -2184,13 +2270,26 @@
         <w:pStyle w:val="text"/>
       </w:pPr>
       <w:r>
-        <w:t>Désormais chargé via $_ENV['DB_PASS'], le fichier .env est ajouté au .</w:t>
+        <w:t xml:space="preserve">Désormais chargé via $_ENV['DB_PASS'], le </w:t>
+      </w:r>
+      <w:proofErr w:type="gramStart"/>
+      <w:r>
+        <w:t>fichier .env</w:t>
+      </w:r>
+      <w:proofErr w:type="gramEnd"/>
+      <w:r>
+        <w:t xml:space="preserve"> est ajouté </w:t>
+      </w:r>
+      <w:proofErr w:type="gramStart"/>
+      <w:r>
+        <w:t>au .</w:t>
       </w:r>
       <w:proofErr w:type="spellStart"/>
       <w:r>
         <w:t>gitignore</w:t>
       </w:r>
       <w:proofErr w:type="spellEnd"/>
+      <w:proofErr w:type="gramEnd"/>
       <w:r>
         <w:t>.</w:t>
       </w:r>
@@ -2211,7 +2310,15 @@
       </w:r>
       <w:proofErr w:type="spellEnd"/>
       <w:r>
-        <w:t xml:space="preserve">=utf8mb4 déclaré dans le DSN. Le </w:t>
+        <w:t xml:space="preserve">=utf8mb4 déclaré dans </w:t>
+      </w:r>
+      <w:proofErr w:type="gramStart"/>
+      <w:r>
+        <w:t>le DSN</w:t>
+      </w:r>
+      <w:proofErr w:type="gramEnd"/>
+      <w:r>
+        <w:t xml:space="preserve">. Le </w:t>
       </w:r>
       <w:proofErr w:type="spellStart"/>
       <w:r>
@@ -2219,7 +2326,15 @@
       </w:r>
       <w:proofErr w:type="spellEnd"/>
       <w:r>
-        <w:t xml:space="preserve"> dans le DSN suffit et s'applique avant l'ouverture de la connexion.</w:t>
+        <w:t xml:space="preserve"> dans </w:t>
+      </w:r>
+      <w:proofErr w:type="gramStart"/>
+      <w:r>
+        <w:t>le DSN</w:t>
+      </w:r>
+      <w:proofErr w:type="gramEnd"/>
+      <w:r>
+        <w:t xml:space="preserve"> suffit et s'applique avant l'ouverture de la connexion.</w:t>
       </w:r>
     </w:p>
     <w:p>
@@ -2233,20 +2348,41 @@
         <w:t>$e-&gt;</w:t>
       </w:r>
       <w:proofErr w:type="spellStart"/>
+      <w:proofErr w:type="gramStart"/>
       <w:r>
         <w:t>getMessage</w:t>
       </w:r>
       <w:proofErr w:type="spellEnd"/>
       <w:r>
-        <w:t xml:space="preserve">() retiré du die() Un message d'erreur technique exposé à l'utilisateur révèle le nom du serveur, la structure de la BDD, etc. Remplacé par </w:t>
+        <w:t>(</w:t>
+      </w:r>
+      <w:proofErr w:type="gramEnd"/>
+      <w:r>
+        <w:t xml:space="preserve">) retiré du </w:t>
+      </w:r>
+      <w:proofErr w:type="gramStart"/>
+      <w:r>
+        <w:t>die(</w:t>
+      </w:r>
+      <w:proofErr w:type="gramEnd"/>
+      <w:r>
+        <w:t xml:space="preserve">) Un message d'erreur technique exposé à l'utilisateur révèle le nom du serveur, la structure de la BDD, etc. Remplacé par </w:t>
       </w:r>
       <w:proofErr w:type="spellStart"/>
       <w:r>
-        <w:t>error_log</w:t>
+        <w:t>error_</w:t>
+      </w:r>
+      <w:proofErr w:type="gramStart"/>
+      <w:r>
+        <w:t>log</w:t>
       </w:r>
       <w:proofErr w:type="spellEnd"/>
       <w:r>
-        <w:t>() côté serveur et un message générique côté client.</w:t>
+        <w:t>(</w:t>
+      </w:r>
+      <w:proofErr w:type="gramEnd"/>
+      <w:r>
+        <w:t>) côté serveur et un message générique côté client.</w:t>
       </w:r>
     </w:p>
     <w:p>
@@ -2307,8 +2443,17 @@
           <w:rFonts w:ascii="Courier New" w:hAnsi="Courier New" w:cs="Courier New"/>
           <w:lang w:val="en-US"/>
         </w:rPr>
-        <w:t xml:space="preserve"> WHERE login = :login</w:t>
-      </w:r>
+        <w:t xml:space="preserve"> WHERE login </w:t>
+      </w:r>
+      <w:proofErr w:type="gramStart"/>
+      <w:r>
+        <w:rPr>
+          <w:rFonts w:ascii="Courier New" w:hAnsi="Courier New" w:cs="Courier New"/>
+          <w:lang w:val="en-US"/>
+        </w:rPr>
+        <w:t>= :login</w:t>
+      </w:r>
+      <w:proofErr w:type="gramEnd"/>
     </w:p>
     <w:p>
       <w:pPr>
@@ -2465,34 +2610,70 @@
           <w:bCs/>
           <w:lang w:val="en-US"/>
         </w:rPr>
-        <w:t>password_hash</w:t>
-      </w:r>
-      <w:proofErr w:type="spellEnd"/>
+        <w:t>password_</w:t>
+      </w:r>
+      <w:proofErr w:type="gramStart"/>
       <w:r>
         <w:rPr>
           <w:b/>
           <w:bCs/>
           <w:lang w:val="en-US"/>
         </w:rPr>
-        <w:t xml:space="preserve">() / </w:t>
-      </w:r>
-      <w:proofErr w:type="spellStart"/>
+        <w:t>hash</w:t>
+      </w:r>
+      <w:proofErr w:type="spellEnd"/>
       <w:r>
         <w:rPr>
           <w:b/>
           <w:bCs/>
           <w:lang w:val="en-US"/>
         </w:rPr>
-        <w:t>password_verify</w:t>
-      </w:r>
-      <w:proofErr w:type="spellEnd"/>
+        <w:t>(</w:t>
+      </w:r>
+      <w:proofErr w:type="gramEnd"/>
       <w:r>
         <w:rPr>
           <w:b/>
           <w:bCs/>
           <w:lang w:val="en-US"/>
         </w:rPr>
-        <w:t>()</w:t>
+        <w:t xml:space="preserve">) / </w:t>
+      </w:r>
+      <w:proofErr w:type="spellStart"/>
+      <w:r>
+        <w:rPr>
+          <w:b/>
+          <w:bCs/>
+          <w:lang w:val="en-US"/>
+        </w:rPr>
+        <w:t>password_</w:t>
+      </w:r>
+      <w:proofErr w:type="gramStart"/>
+      <w:r>
+        <w:rPr>
+          <w:b/>
+          <w:bCs/>
+          <w:lang w:val="en-US"/>
+        </w:rPr>
+        <w:t>verify</w:t>
+      </w:r>
+      <w:proofErr w:type="spellEnd"/>
+      <w:r>
+        <w:rPr>
+          <w:b/>
+          <w:bCs/>
+          <w:lang w:val="en-US"/>
+        </w:rPr>
+        <w:t>(</w:t>
+      </w:r>
+      <w:proofErr w:type="gramEnd"/>
+      <w:r>
+        <w:rPr>
+          <w:b/>
+          <w:bCs/>
+          <w:lang w:val="en-US"/>
+        </w:rPr>
+        <w:t>)</w:t>
       </w:r>
       <w:r>
         <w:rPr>
@@ -2630,14 +2811,28 @@
               <w:rPr>
                 <w:lang w:val="en-US"/>
               </w:rPr>
-              <w:t>password_hash</w:t>
+              <w:t>password_</w:t>
+            </w:r>
+            <w:proofErr w:type="gramStart"/>
+            <w:r>
+              <w:rPr>
+                <w:lang w:val="en-US"/>
+              </w:rPr>
+              <w:t>hash</w:t>
             </w:r>
             <w:proofErr w:type="spellEnd"/>
             <w:r>
               <w:rPr>
                 <w:lang w:val="en-US"/>
               </w:rPr>
-              <w:t>($pass, PASSWORD_BCRYPT, ['cost' =&gt; 12])</w:t>
+              <w:t>(</w:t>
+            </w:r>
+            <w:proofErr w:type="gramEnd"/>
+            <w:r>
+              <w:rPr>
+                <w:lang w:val="en-US"/>
+              </w:rPr>
+              <w:t>$pass, PASSWORD_BCRYPT, ['cost' =&gt; 12])</w:t>
             </w:r>
           </w:p>
         </w:tc>
@@ -2679,14 +2874,28 @@
               <w:rPr>
                 <w:lang w:val="en-US"/>
               </w:rPr>
-              <w:t>password_verify</w:t>
+              <w:t>password_</w:t>
+            </w:r>
+            <w:proofErr w:type="gramStart"/>
+            <w:r>
+              <w:rPr>
+                <w:lang w:val="en-US"/>
+              </w:rPr>
+              <w:t>verify</w:t>
             </w:r>
             <w:proofErr w:type="spellEnd"/>
             <w:r>
               <w:rPr>
                 <w:lang w:val="en-US"/>
               </w:rPr>
-              <w:t>($</w:t>
+              <w:t>(</w:t>
+            </w:r>
+            <w:proofErr w:type="gramEnd"/>
+            <w:r>
+              <w:rPr>
+                <w:lang w:val="en-US"/>
+              </w:rPr>
+              <w:t>$</w:t>
             </w:r>
             <w:proofErr w:type="spellStart"/>
             <w:r>
@@ -2853,19 +3062,43 @@
       </w:r>
       <w:proofErr w:type="spellStart"/>
       <w:r>
-        <w:t>password_hash</w:t>
+        <w:t>password_</w:t>
+      </w:r>
+      <w:proofErr w:type="gramStart"/>
+      <w:r>
+        <w:t>hash</w:t>
       </w:r>
       <w:proofErr w:type="spellEnd"/>
       <w:r>
-        <w:t>(). Protégé contre l'exécution HTTP (</w:t>
+        <w:t>(</w:t>
+      </w:r>
+      <w:proofErr w:type="gramEnd"/>
+      <w:r>
+        <w:t>). Protégé contre l'exécution HTTP (</w:t>
       </w:r>
       <w:proofErr w:type="spellStart"/>
       <w:r>
-        <w:t>php_sapi_name</w:t>
+        <w:t>php_sapi_</w:t>
+      </w:r>
+      <w:proofErr w:type="gramStart"/>
+      <w:r>
+        <w:t>name</w:t>
       </w:r>
       <w:proofErr w:type="spellEnd"/>
       <w:r>
-        <w:t>() !== 'cli').</w:t>
+        <w:t>(</w:t>
+      </w:r>
+      <w:proofErr w:type="gramEnd"/>
+      <w:r>
+        <w:t>)</w:t>
+      </w:r>
+      <w:proofErr w:type="gramStart"/>
+      <w:r>
+        <w:t xml:space="preserve"> !=</w:t>
+      </w:r>
+      <w:proofErr w:type="gramEnd"/>
+      <w:r>
+        <w:t>= 'cli').</w:t>
       </w:r>
     </w:p>
     <w:p>

</xml_diff>